<commit_message>
Added test cases for parser
</commit_message>
<xml_diff>
--- a/documentation/05-Test-Cases.docx
+++ b/documentation/05-Test-Cases.docx
@@ -1492,10 +1492,7 @@
               </w:rPr>
             </w:pPr>
             <w:r>
-              <w:t>P-TC0</w:t>
-            </w:r>
-            <w:r>
-              <w:t>2</w:t>
+              <w:t>P-TC02</w:t>
             </w:r>
           </w:p>
         </w:tc>
@@ -1589,6 +1586,153 @@
                 <w:color w:val="000000"/>
               </w:rPr>
               <w:t xml:space="preserve">       * + 3 4 2</w:t>
+            </w:r>
+          </w:p>
+        </w:tc>
+        <w:tc>
+          <w:tcPr>
+            <w:tcW w:w="1039" w:type="dxa"/>
+            <w:vAlign w:val="center"/>
+          </w:tcPr>
+          <w:p>
+            <w:pPr>
+              <w:pStyle w:val="BodyText"/>
+              <w:spacing w:after="0"/>
+              <w:ind w:left="0"/>
+              <w:jc w:val="center"/>
+              <w:rPr>
+                <w:iCs/>
+                <w:color w:val="000000"/>
+              </w:rPr>
+            </w:pPr>
+            <w:r>
+              <w:rPr>
+                <w:iCs/>
+                <w:color w:val="000000"/>
+              </w:rPr>
+              <w:t>Pass</w:t>
+            </w:r>
+          </w:p>
+        </w:tc>
+      </w:tr>
+      <w:tr>
+        <w:trPr>
+          <w:trHeight w:val="584"/>
+        </w:trPr>
+        <w:tc>
+          <w:tcPr>
+            <w:tcW w:w="1361" w:type="dxa"/>
+            <w:vAlign w:val="center"/>
+          </w:tcPr>
+          <w:p>
+            <w:pPr>
+              <w:pStyle w:val="BodyText"/>
+              <w:spacing w:after="0"/>
+              <w:ind w:left="0"/>
+              <w:jc w:val="center"/>
+              <w:rPr>
+                <w:iCs/>
+                <w:color w:val="000000"/>
+              </w:rPr>
+            </w:pPr>
+            <w:r>
+              <w:t>P-TC03</w:t>
+            </w:r>
+          </w:p>
+        </w:tc>
+        <w:tc>
+          <w:tcPr>
+            <w:tcW w:w="1791" w:type="dxa"/>
+            <w:vAlign w:val="center"/>
+          </w:tcPr>
+          <w:p>
+            <w:pPr>
+              <w:pStyle w:val="BodyText"/>
+              <w:spacing w:after="0"/>
+              <w:ind w:left="0"/>
+              <w:jc w:val="center"/>
+              <w:rPr>
+                <w:iCs/>
+                <w:color w:val="000000"/>
+              </w:rPr>
+            </w:pPr>
+            <w:r>
+              <w:rPr>
+                <w:iCs/>
+                <w:color w:val="000000"/>
+              </w:rPr>
+              <w:t>Verify parser handles nested expressions</w:t>
+            </w:r>
+          </w:p>
+        </w:tc>
+        <w:tc>
+          <w:tcPr>
+            <w:tcW w:w="1696" w:type="dxa"/>
+            <w:vAlign w:val="center"/>
+          </w:tcPr>
+          <w:p>
+            <w:pPr>
+              <w:pStyle w:val="BodyText"/>
+              <w:spacing w:after="0"/>
+              <w:ind w:left="0"/>
+              <w:jc w:val="center"/>
+              <w:rPr>
+                <w:iCs/>
+                <w:color w:val="000000"/>
+              </w:rPr>
+            </w:pPr>
+            <w:r>
+              <w:t>8 - (5 - 2)</w:t>
+            </w:r>
+          </w:p>
+        </w:tc>
+        <w:tc>
+          <w:tcPr>
+            <w:tcW w:w="1791" w:type="dxa"/>
+            <w:vAlign w:val="center"/>
+          </w:tcPr>
+          <w:p>
+            <w:pPr>
+              <w:pStyle w:val="BodyText"/>
+              <w:spacing w:after="0"/>
+              <w:ind w:left="0"/>
+              <w:jc w:val="center"/>
+              <w:rPr>
+                <w:iCs/>
+                <w:color w:val="000000"/>
+              </w:rPr>
+            </w:pPr>
+            <w:r>
+              <w:rPr>
+                <w:iCs/>
+                <w:color w:val="000000"/>
+              </w:rPr>
+              <w:t>Prefix: - 8 - 5 2</w:t>
+            </w:r>
+          </w:p>
+        </w:tc>
+        <w:tc>
+          <w:tcPr>
+            <w:tcW w:w="1791" w:type="dxa"/>
+            <w:vAlign w:val="center"/>
+          </w:tcPr>
+          <w:p>
+            <w:pPr>
+              <w:pStyle w:val="BodyText"/>
+              <w:spacing w:after="0"/>
+              <w:ind w:left="0"/>
+              <w:jc w:val="center"/>
+              <w:rPr>
+                <w:iCs/>
+                <w:color w:val="000000"/>
+              </w:rPr>
+            </w:pPr>
+            <w:r>
+              <w:rPr>
+                <w:iCs/>
+                <w:color w:val="000000"/>
+              </w:rPr>
+              <w:t>- 8 - 5 2</w:t>
             </w:r>
           </w:p>
         </w:tc>
@@ -1639,10 +1783,7 @@
               </w:rPr>
             </w:pPr>
             <w:r>
-              <w:t>P-TC0</w:t>
-            </w:r>
-            <w:r>
-              <w:t>3</w:t>
+              <w:t>P-TC04</w:t>
             </w:r>
           </w:p>
         </w:tc>
@@ -1667,7 +1808,28 @@
                 <w:iCs/>
                 <w:color w:val="000000"/>
               </w:rPr>
-              <w:t>Verify parser handles nested expressions</w:t>
+              <w:t xml:space="preserve">Verify parser handles </w:t>
+            </w:r>
+            <w:r>
+              <w:rPr>
+                <w:iCs/>
+                <w:color w:val="000000"/>
+              </w:rPr>
+              <w:t>left</w:t>
+            </w:r>
+            <w:r>
+              <w:rPr>
+                <w:iCs/>
+                <w:color w:val="000000"/>
+              </w:rPr>
+              <w:t xml:space="preserve">-associative </w:t>
+            </w:r>
+            <w:r>
+              <w:rPr>
+                <w:iCs/>
+                <w:color w:val="000000"/>
+              </w:rPr>
+              <w:t>subtraction</w:t>
             </w:r>
           </w:p>
         </w:tc>
@@ -1688,7 +1850,7 @@
               </w:rPr>
             </w:pPr>
             <w:r>
-              <w:t>8 - (5 - 2)</w:t>
+              <w:t>10 - 3 - 2</w:t>
             </w:r>
           </w:p>
         </w:tc>
@@ -1713,7 +1875,7 @@
                 <w:iCs/>
                 <w:color w:val="000000"/>
               </w:rPr>
-              <w:t>Prefix: - 8 - 5 2</w:t>
+              <w:t>Prefix: - - 10 3 2</w:t>
             </w:r>
           </w:p>
         </w:tc>
@@ -1738,7 +1900,7 @@
                 <w:iCs/>
                 <w:color w:val="000000"/>
               </w:rPr>
-              <w:t>- 8 - 5 2</w:t>
+              <w:t>- - 10 3 2</w:t>
             </w:r>
           </w:p>
         </w:tc>
@@ -1789,10 +1951,7 @@
               </w:rPr>
             </w:pPr>
             <w:r>
-              <w:t>P-TC0</w:t>
-            </w:r>
-            <w:r>
-              <w:t>4</w:t>
+              <w:t>P-TC05</w:t>
             </w:r>
           </w:p>
         </w:tc>
@@ -1817,28 +1976,7 @@
                 <w:iCs/>
                 <w:color w:val="000000"/>
               </w:rPr>
-              <w:t xml:space="preserve">Verify parser handles </w:t>
-            </w:r>
-            <w:r>
-              <w:rPr>
-                <w:iCs/>
-                <w:color w:val="000000"/>
-              </w:rPr>
-              <w:t>left</w:t>
-            </w:r>
-            <w:r>
-              <w:rPr>
-                <w:iCs/>
-                <w:color w:val="000000"/>
-              </w:rPr>
-              <w:t xml:space="preserve">-associative </w:t>
-            </w:r>
-            <w:r>
-              <w:rPr>
-                <w:iCs/>
-                <w:color w:val="000000"/>
-              </w:rPr>
-              <w:t>subtraction</w:t>
+              <w:t>Verify parser handles right-associative exponentiation</w:t>
             </w:r>
           </w:p>
         </w:tc>
@@ -1859,7 +1997,7 @@
               </w:rPr>
             </w:pPr>
             <w:r>
-              <w:t>10 - 3 - 2</w:t>
+              <w:t>2 ** 3 ** 2</w:t>
             </w:r>
           </w:p>
         </w:tc>
@@ -1884,7 +2022,7 @@
                 <w:iCs/>
                 <w:color w:val="000000"/>
               </w:rPr>
-              <w:t>Prefix: - - 10 3 2</w:t>
+              <w:t>Prefix: ** 2 ** 3 2</w:t>
             </w:r>
           </w:p>
         </w:tc>
@@ -1909,7 +2047,7 @@
                 <w:iCs/>
                 <w:color w:val="000000"/>
               </w:rPr>
-              <w:t>- - 10 3 2</w:t>
+              <w:t>** 2 ** 3 2</w:t>
             </w:r>
           </w:p>
         </w:tc>
@@ -1960,181 +2098,7 @@
               </w:rPr>
             </w:pPr>
             <w:r>
-              <w:t>P-TC0</w:t>
-            </w:r>
-            <w:r>
-              <w:t>5</w:t>
-            </w:r>
-          </w:p>
-        </w:tc>
-        <w:tc>
-          <w:tcPr>
-            <w:tcW w:w="1791" w:type="dxa"/>
-            <w:vAlign w:val="center"/>
-          </w:tcPr>
-          <w:p>
-            <w:pPr>
-              <w:pStyle w:val="BodyText"/>
-              <w:spacing w:after="0"/>
-              <w:ind w:left="0"/>
-              <w:jc w:val="center"/>
-              <w:rPr>
-                <w:iCs/>
-                <w:color w:val="000000"/>
-              </w:rPr>
-            </w:pPr>
-            <w:r>
-              <w:rPr>
-                <w:iCs/>
-                <w:color w:val="000000"/>
-              </w:rPr>
-              <w:t xml:space="preserve">Verify parser handles </w:t>
-            </w:r>
-            <w:r>
-              <w:rPr>
-                <w:iCs/>
-                <w:color w:val="000000"/>
-              </w:rPr>
-              <w:t>right</w:t>
-            </w:r>
-            <w:r>
-              <w:rPr>
-                <w:iCs/>
-                <w:color w:val="000000"/>
-              </w:rPr>
-              <w:t xml:space="preserve">-associative </w:t>
-            </w:r>
-            <w:r>
-              <w:rPr>
-                <w:iCs/>
-                <w:color w:val="000000"/>
-              </w:rPr>
-              <w:t>exponentiation</w:t>
-            </w:r>
-          </w:p>
-        </w:tc>
-        <w:tc>
-          <w:tcPr>
-            <w:tcW w:w="1696" w:type="dxa"/>
-            <w:vAlign w:val="center"/>
-          </w:tcPr>
-          <w:p>
-            <w:pPr>
-              <w:pStyle w:val="BodyText"/>
-              <w:spacing w:after="0"/>
-              <w:ind w:left="0"/>
-              <w:jc w:val="center"/>
-              <w:rPr>
-                <w:iCs/>
-                <w:color w:val="000000"/>
-              </w:rPr>
-            </w:pPr>
-            <w:r>
-              <w:t>2 ** 3 ** 2</w:t>
-            </w:r>
-          </w:p>
-        </w:tc>
-        <w:tc>
-          <w:tcPr>
-            <w:tcW w:w="1791" w:type="dxa"/>
-            <w:vAlign w:val="center"/>
-          </w:tcPr>
-          <w:p>
-            <w:pPr>
-              <w:pStyle w:val="BodyText"/>
-              <w:spacing w:after="0"/>
-              <w:ind w:left="0"/>
-              <w:jc w:val="center"/>
-              <w:rPr>
-                <w:iCs/>
-                <w:color w:val="000000"/>
-              </w:rPr>
-            </w:pPr>
-            <w:r>
-              <w:rPr>
-                <w:iCs/>
-                <w:color w:val="000000"/>
-              </w:rPr>
-              <w:t>Prefix: ** 2 ** 3 2</w:t>
-            </w:r>
-          </w:p>
-        </w:tc>
-        <w:tc>
-          <w:tcPr>
-            <w:tcW w:w="1791" w:type="dxa"/>
-            <w:vAlign w:val="center"/>
-          </w:tcPr>
-          <w:p>
-            <w:pPr>
-              <w:pStyle w:val="BodyText"/>
-              <w:spacing w:after="0"/>
-              <w:ind w:left="0"/>
-              <w:jc w:val="center"/>
-              <w:rPr>
-                <w:iCs/>
-                <w:color w:val="000000"/>
-              </w:rPr>
-            </w:pPr>
-            <w:r>
-              <w:rPr>
-                <w:iCs/>
-                <w:color w:val="000000"/>
-              </w:rPr>
-              <w:t>** 2 ** 3 2</w:t>
-            </w:r>
-          </w:p>
-        </w:tc>
-        <w:tc>
-          <w:tcPr>
-            <w:tcW w:w="1039" w:type="dxa"/>
-            <w:vAlign w:val="center"/>
-          </w:tcPr>
-          <w:p>
-            <w:pPr>
-              <w:pStyle w:val="BodyText"/>
-              <w:spacing w:after="0"/>
-              <w:ind w:left="0"/>
-              <w:jc w:val="center"/>
-              <w:rPr>
-                <w:iCs/>
-                <w:color w:val="000000"/>
-              </w:rPr>
-            </w:pPr>
-            <w:r>
-              <w:rPr>
-                <w:iCs/>
-                <w:color w:val="000000"/>
-              </w:rPr>
-              <w:t>Pass</w:t>
-            </w:r>
-          </w:p>
-        </w:tc>
-      </w:tr>
-      <w:tr>
-        <w:trPr>
-          <w:trHeight w:val="525"/>
-        </w:trPr>
-        <w:tc>
-          <w:tcPr>
-            <w:tcW w:w="1361" w:type="dxa"/>
-            <w:vAlign w:val="center"/>
-          </w:tcPr>
-          <w:p>
-            <w:pPr>
-              <w:pStyle w:val="BodyText"/>
-              <w:spacing w:after="0"/>
-              <w:ind w:left="0"/>
-              <w:jc w:val="center"/>
-              <w:rPr>
-                <w:iCs/>
-                <w:color w:val="000000"/>
-              </w:rPr>
-            </w:pPr>
-            <w:r>
-              <w:t>P-TC0</w:t>
-            </w:r>
-            <w:r>
-              <w:t>6</w:t>
+              <w:t>P-TC06</w:t>
             </w:r>
           </w:p>
         </w:tc>
@@ -2281,10 +2245,7 @@
               <w:jc w:val="center"/>
             </w:pPr>
             <w:r>
-              <w:t>P-TC</w:t>
-            </w:r>
-            <w:r>
-              <w:t>07</w:t>
+              <w:t>P-TC07</w:t>
             </w:r>
           </w:p>
         </w:tc>
@@ -2692,14 +2653,7 @@
                 <w:iCs/>
                 <w:color w:val="000000"/>
               </w:rPr>
-              <w:t>Expected closing parenthesis</w:t>
-            </w:r>
-            <w:r>
-              <w:rPr>
-                <w:iCs/>
-                <w:color w:val="000000"/>
-              </w:rPr>
-              <w:t xml:space="preserve"> ‘)’</w:t>
+              <w:t>Expected closing parenthesis ‘)’</w:t>
             </w:r>
           </w:p>
         </w:tc>
@@ -2865,14 +2819,7 @@
                 <w:color w:val="000000"/>
               </w:rPr>
               <w:lastRenderedPageBreak/>
-              <w:t xml:space="preserve">Unexpected token after </w:t>
-            </w:r>
-            <w:r>
-              <w:rPr>
-                <w:iCs/>
-                <w:color w:val="000000"/>
-              </w:rPr>
-              <w:t xml:space="preserve">end of </w:t>
+              <w:t xml:space="preserve">Unexpected token after end of </w:t>
             </w:r>
             <w:r>
               <w:rPr>
@@ -2880,14 +2827,7 @@
                 <w:color w:val="000000"/>
               </w:rPr>
               <w:lastRenderedPageBreak/>
-              <w:t>expression</w:t>
-            </w:r>
-            <w:r>
-              <w:rPr>
-                <w:iCs/>
-                <w:color w:val="000000"/>
-              </w:rPr>
-              <w:t>:</w:t>
+              <w:t>expression:</w:t>
             </w:r>
             <w:r>
               <w:rPr>
@@ -2928,758 +2868,6 @@
               </w:rPr>
               <w:lastRenderedPageBreak/>
               <w:t>Pass</w:t>
-            </w:r>
-          </w:p>
-        </w:tc>
-      </w:tr>
-      <w:tr>
-        <w:trPr>
-          <w:trHeight w:val="489"/>
-        </w:trPr>
-        <w:tc>
-          <w:tcPr>
-            <w:tcW w:w="1361" w:type="dxa"/>
-            <w:vAlign w:val="center"/>
-          </w:tcPr>
-          <w:p>
-            <w:pPr>
-              <w:pStyle w:val="BodyText"/>
-              <w:spacing w:after="0"/>
-              <w:ind w:left="0"/>
-              <w:jc w:val="center"/>
-              <w:rPr>
-                <w:iCs/>
-                <w:color w:val="000000"/>
-              </w:rPr>
-            </w:pPr>
-            <w:r>
-              <w:t>P-TC</w:t>
-            </w:r>
-            <w:r>
-              <w:t>1</w:t>
-            </w:r>
-            <w:r>
-              <w:t>1</w:t>
-            </w:r>
-          </w:p>
-        </w:tc>
-        <w:tc>
-          <w:tcPr>
-            <w:tcW w:w="1791" w:type="dxa"/>
-            <w:vAlign w:val="center"/>
-          </w:tcPr>
-          <w:p>
-            <w:pPr>
-              <w:pStyle w:val="BodyText"/>
-              <w:spacing w:after="0"/>
-              <w:ind w:left="0"/>
-              <w:jc w:val="center"/>
-              <w:rPr>
-                <w:iCs/>
-                <w:color w:val="000000"/>
-              </w:rPr>
-            </w:pPr>
-            <w:r>
-              <w:rPr>
-                <w:iCs/>
-                <w:color w:val="000000"/>
-              </w:rPr>
-              <w:t>Detect consecutive operators</w:t>
-            </w:r>
-          </w:p>
-        </w:tc>
-        <w:tc>
-          <w:tcPr>
-            <w:tcW w:w="1696" w:type="dxa"/>
-            <w:vAlign w:val="center"/>
-          </w:tcPr>
-          <w:p>
-            <w:pPr>
-              <w:pStyle w:val="BodyText"/>
-              <w:spacing w:after="0"/>
-              <w:ind w:left="0"/>
-              <w:jc w:val="center"/>
-              <w:rPr>
-                <w:iCs/>
-                <w:color w:val="000000"/>
-              </w:rPr>
-            </w:pPr>
-            <w:r>
-              <w:rPr>
-                <w:iCs/>
-                <w:color w:val="000000"/>
-              </w:rPr>
-              <w:t>3 + * 4</w:t>
-            </w:r>
-          </w:p>
-        </w:tc>
-        <w:tc>
-          <w:tcPr>
-            <w:tcW w:w="1791" w:type="dxa"/>
-            <w:vAlign w:val="center"/>
-          </w:tcPr>
-          <w:p>
-            <w:pPr>
-              <w:pStyle w:val="BodyText"/>
-              <w:spacing w:after="0"/>
-              <w:ind w:left="0"/>
-              <w:jc w:val="center"/>
-              <w:rPr>
-                <w:iCs/>
-                <w:color w:val="000000"/>
-              </w:rPr>
-            </w:pPr>
-            <w:r>
-              <w:rPr>
-                <w:iCs/>
-                <w:color w:val="000000"/>
-              </w:rPr>
-              <w:t>Error: Unexpected token</w:t>
-            </w:r>
-          </w:p>
-        </w:tc>
-        <w:tc>
-          <w:tcPr>
-            <w:tcW w:w="1791" w:type="dxa"/>
-            <w:vAlign w:val="center"/>
-          </w:tcPr>
-          <w:p>
-            <w:pPr>
-              <w:pStyle w:val="BodyText"/>
-              <w:spacing w:after="0"/>
-              <w:ind w:left="0"/>
-              <w:jc w:val="center"/>
-              <w:rPr>
-                <w:iCs/>
-                <w:color w:val="000000"/>
-              </w:rPr>
-            </w:pPr>
-            <w:r>
-              <w:rPr>
-                <w:iCs/>
-                <w:color w:val="000000"/>
-              </w:rPr>
-              <w:t>Unexpected token</w:t>
-            </w:r>
-            <w:r>
-              <w:rPr>
-                <w:iCs/>
-                <w:color w:val="000000"/>
-              </w:rPr>
-              <w:t>: *</w:t>
-            </w:r>
-          </w:p>
-        </w:tc>
-        <w:tc>
-          <w:tcPr>
-            <w:tcW w:w="1039" w:type="dxa"/>
-            <w:vAlign w:val="center"/>
-          </w:tcPr>
-          <w:p>
-            <w:pPr>
-              <w:pStyle w:val="BodyText"/>
-              <w:spacing w:after="0"/>
-              <w:ind w:left="0"/>
-              <w:jc w:val="center"/>
-              <w:rPr>
-                <w:iCs/>
-                <w:color w:val="000000"/>
-              </w:rPr>
-            </w:pPr>
-            <w:r>
-              <w:rPr>
-                <w:iCs/>
-                <w:color w:val="000000"/>
-              </w:rPr>
-              <w:t>Pass</w:t>
-            </w:r>
-          </w:p>
-        </w:tc>
-      </w:tr>
-      <w:tr>
-        <w:trPr>
-          <w:trHeight w:val="489"/>
-        </w:trPr>
-        <w:tc>
-          <w:tcPr>
-            <w:tcW w:w="1361" w:type="dxa"/>
-            <w:vAlign w:val="center"/>
-          </w:tcPr>
-          <w:p>
-            <w:pPr>
-              <w:pStyle w:val="BodyText"/>
-              <w:spacing w:after="0"/>
-              <w:ind w:left="0"/>
-              <w:jc w:val="center"/>
-            </w:pPr>
-            <w:r>
-              <w:t>P-TC12</w:t>
-            </w:r>
-          </w:p>
-        </w:tc>
-        <w:tc>
-          <w:tcPr>
-            <w:tcW w:w="1791" w:type="dxa"/>
-            <w:vAlign w:val="center"/>
-          </w:tcPr>
-          <w:p>
-            <w:pPr>
-              <w:pStyle w:val="BodyText"/>
-              <w:spacing w:after="0"/>
-              <w:ind w:left="0"/>
-              <w:jc w:val="center"/>
-              <w:rPr>
-                <w:iCs/>
-                <w:color w:val="000000"/>
-              </w:rPr>
-            </w:pPr>
-            <w:r>
-              <w:t>Verify parser handles leading negative number</w:t>
-            </w:r>
-          </w:p>
-        </w:tc>
-        <w:tc>
-          <w:tcPr>
-            <w:tcW w:w="1696" w:type="dxa"/>
-            <w:vAlign w:val="center"/>
-          </w:tcPr>
-          <w:p>
-            <w:pPr>
-              <w:pStyle w:val="BodyText"/>
-              <w:spacing w:after="0"/>
-              <w:ind w:left="0"/>
-              <w:jc w:val="center"/>
-              <w:rPr>
-                <w:iCs/>
-                <w:color w:val="000000"/>
-              </w:rPr>
-            </w:pPr>
-            <w:r>
-              <w:t>-5 + 3</w:t>
-            </w:r>
-          </w:p>
-        </w:tc>
-        <w:tc>
-          <w:tcPr>
-            <w:tcW w:w="1791" w:type="dxa"/>
-            <w:vAlign w:val="center"/>
-          </w:tcPr>
-          <w:p>
-            <w:pPr>
-              <w:pStyle w:val="BodyText"/>
-              <w:spacing w:after="0"/>
-              <w:ind w:left="0"/>
-              <w:jc w:val="center"/>
-              <w:rPr>
-                <w:iCs/>
-                <w:color w:val="000000"/>
-              </w:rPr>
-            </w:pPr>
-            <w:r>
-              <w:t xml:space="preserve">Prefix: </w:t>
-            </w:r>
-            <w:r>
-              <w:rPr>
-                <w:rStyle w:val="HTMLCode"/>
-                <w:rFonts w:ascii="Times New Roman" w:hAnsi="Times New Roman" w:cs="Times New Roman"/>
-              </w:rPr>
-              <w:t>+ -5 3</w:t>
-            </w:r>
-          </w:p>
-        </w:tc>
-        <w:tc>
-          <w:tcPr>
-            <w:tcW w:w="1791" w:type="dxa"/>
-            <w:vAlign w:val="center"/>
-          </w:tcPr>
-          <w:p>
-            <w:pPr>
-              <w:pStyle w:val="BodyText"/>
-              <w:spacing w:after="0"/>
-              <w:ind w:left="0"/>
-              <w:jc w:val="center"/>
-              <w:rPr>
-                <w:iCs/>
-                <w:color w:val="000000"/>
-              </w:rPr>
-            </w:pPr>
-            <w:r>
-              <w:rPr>
-                <w:iCs/>
-                <w:color w:val="000000"/>
-              </w:rPr>
-              <w:t>Segmentation fault</w:t>
-            </w:r>
-          </w:p>
-        </w:tc>
-        <w:tc>
-          <w:tcPr>
-            <w:tcW w:w="1039" w:type="dxa"/>
-            <w:vAlign w:val="center"/>
-          </w:tcPr>
-          <w:p>
-            <w:pPr>
-              <w:pStyle w:val="BodyText"/>
-              <w:spacing w:after="0"/>
-              <w:ind w:left="0"/>
-              <w:jc w:val="center"/>
-              <w:rPr>
-                <w:iCs/>
-                <w:color w:val="000000"/>
-              </w:rPr>
-            </w:pPr>
-            <w:r>
-              <w:rPr>
-                <w:iCs/>
-                <w:color w:val="000000"/>
-              </w:rPr>
-              <w:t>Fail</w:t>
-            </w:r>
-          </w:p>
-        </w:tc>
-      </w:tr>
-      <w:tr>
-        <w:trPr>
-          <w:trHeight w:val="489"/>
-        </w:trPr>
-        <w:tc>
-          <w:tcPr>
-            <w:tcW w:w="1361" w:type="dxa"/>
-            <w:vAlign w:val="center"/>
-          </w:tcPr>
-          <w:p>
-            <w:pPr>
-              <w:pStyle w:val="BodyText"/>
-              <w:spacing w:after="0"/>
-              <w:ind w:left="0"/>
-              <w:jc w:val="center"/>
-            </w:pPr>
-            <w:r>
-              <w:t>P-TC1</w:t>
-            </w:r>
-            <w:r>
-              <w:t>3</w:t>
-            </w:r>
-          </w:p>
-        </w:tc>
-        <w:tc>
-          <w:tcPr>
-            <w:tcW w:w="1791" w:type="dxa"/>
-            <w:vAlign w:val="center"/>
-          </w:tcPr>
-          <w:p>
-            <w:pPr>
-              <w:pStyle w:val="BodyText"/>
-              <w:spacing w:after="0"/>
-              <w:ind w:left="0"/>
-              <w:jc w:val="center"/>
-              <w:rPr>
-                <w:iCs/>
-                <w:color w:val="000000"/>
-              </w:rPr>
-            </w:pPr>
-            <w:r>
-              <w:t>Verify parser handles unary negation with parentheses</w:t>
-            </w:r>
-          </w:p>
-        </w:tc>
-        <w:tc>
-          <w:tcPr>
-            <w:tcW w:w="1696" w:type="dxa"/>
-            <w:vAlign w:val="center"/>
-          </w:tcPr>
-          <w:p>
-            <w:pPr>
-              <w:pStyle w:val="BodyText"/>
-              <w:spacing w:after="0"/>
-              <w:ind w:left="0"/>
-              <w:jc w:val="center"/>
-              <w:rPr>
-                <w:iCs/>
-                <w:color w:val="000000"/>
-              </w:rPr>
-            </w:pPr>
-            <w:r>
-              <w:t>-(2 + 3) * 4</w:t>
-            </w:r>
-          </w:p>
-        </w:tc>
-        <w:tc>
-          <w:tcPr>
-            <w:tcW w:w="1791" w:type="dxa"/>
-            <w:vAlign w:val="center"/>
-          </w:tcPr>
-          <w:p>
-            <w:pPr>
-              <w:pStyle w:val="BodyText"/>
-              <w:spacing w:after="0"/>
-              <w:ind w:left="0"/>
-              <w:jc w:val="center"/>
-              <w:rPr>
-                <w:iCs/>
-                <w:color w:val="000000"/>
-              </w:rPr>
-            </w:pPr>
-            <w:r>
-              <w:t xml:space="preserve">Prefix: </w:t>
-            </w:r>
-            <w:r>
-              <w:rPr>
-                <w:rStyle w:val="HTMLCode"/>
-                <w:rFonts w:ascii="Times New Roman" w:hAnsi="Times New Roman" w:cs="Times New Roman"/>
-              </w:rPr>
-              <w:t>* - + 2 3 4</w:t>
-            </w:r>
-            <w:r>
-              <w:t xml:space="preserve"> or </w:t>
-            </w:r>
-            <w:r>
-              <w:rPr>
-                <w:rStyle w:val="HTMLCode"/>
-                <w:rFonts w:ascii="Times New Roman" w:hAnsi="Times New Roman" w:cs="Times New Roman"/>
-              </w:rPr>
-              <w:t>* neg + 2 3 4</w:t>
-            </w:r>
-          </w:p>
-        </w:tc>
-        <w:tc>
-          <w:tcPr>
-            <w:tcW w:w="1791" w:type="dxa"/>
-            <w:vAlign w:val="center"/>
-          </w:tcPr>
-          <w:p>
-            <w:pPr>
-              <w:pStyle w:val="BodyText"/>
-              <w:spacing w:after="0"/>
-              <w:ind w:left="0"/>
-              <w:jc w:val="center"/>
-              <w:rPr>
-                <w:iCs/>
-                <w:color w:val="000000"/>
-              </w:rPr>
-            </w:pPr>
-            <w:r>
-              <w:rPr>
-                <w:iCs/>
-                <w:color w:val="000000"/>
-              </w:rPr>
-              <w:t>Segmentation fault</w:t>
-            </w:r>
-          </w:p>
-        </w:tc>
-        <w:tc>
-          <w:tcPr>
-            <w:tcW w:w="1039" w:type="dxa"/>
-            <w:vAlign w:val="center"/>
-          </w:tcPr>
-          <w:p>
-            <w:pPr>
-              <w:pStyle w:val="BodyText"/>
-              <w:spacing w:after="0"/>
-              <w:ind w:left="0"/>
-              <w:jc w:val="center"/>
-              <w:rPr>
-                <w:iCs/>
-                <w:color w:val="000000"/>
-              </w:rPr>
-            </w:pPr>
-            <w:r>
-              <w:rPr>
-                <w:iCs/>
-                <w:color w:val="000000"/>
-              </w:rPr>
-              <w:t>Fail</w:t>
-            </w:r>
-          </w:p>
-        </w:tc>
-      </w:tr>
-      <w:tr>
-        <w:trPr>
-          <w:trHeight w:val="489"/>
-        </w:trPr>
-        <w:tc>
-          <w:tcPr>
-            <w:tcW w:w="1361" w:type="dxa"/>
-            <w:vAlign w:val="center"/>
-          </w:tcPr>
-          <w:p>
-            <w:pPr>
-              <w:pStyle w:val="BodyText"/>
-              <w:spacing w:after="0"/>
-              <w:ind w:left="0"/>
-              <w:jc w:val="center"/>
-            </w:pPr>
-            <w:r>
-              <w:t>P-TC1</w:t>
-            </w:r>
-            <w:r>
-              <w:t>4</w:t>
-            </w:r>
-          </w:p>
-        </w:tc>
-        <w:tc>
-          <w:tcPr>
-            <w:tcW w:w="1791" w:type="dxa"/>
-            <w:vAlign w:val="center"/>
-          </w:tcPr>
-          <w:p>
-            <w:pPr>
-              <w:pStyle w:val="BodyText"/>
-              <w:spacing w:after="0"/>
-              <w:ind w:left="0"/>
-              <w:jc w:val="center"/>
-              <w:rPr>
-                <w:iCs/>
-                <w:color w:val="000000"/>
-              </w:rPr>
-            </w:pPr>
-            <w:r>
-              <w:t xml:space="preserve">Verify parser handles decimal </w:t>
-            </w:r>
-            <w:r>
-              <w:t>expression</w:t>
-            </w:r>
-          </w:p>
-        </w:tc>
-        <w:tc>
-          <w:tcPr>
-            <w:tcW w:w="1696" w:type="dxa"/>
-            <w:vAlign w:val="center"/>
-          </w:tcPr>
-          <w:p>
-            <w:pPr>
-              <w:pStyle w:val="BodyText"/>
-              <w:spacing w:after="0"/>
-              <w:ind w:left="0"/>
-              <w:jc w:val="center"/>
-              <w:rPr>
-                <w:iCs/>
-                <w:color w:val="000000"/>
-              </w:rPr>
-            </w:pPr>
-            <w:r>
-              <w:t>3.14 * 2</w:t>
-            </w:r>
-          </w:p>
-        </w:tc>
-        <w:tc>
-          <w:tcPr>
-            <w:tcW w:w="1791" w:type="dxa"/>
-            <w:vAlign w:val="center"/>
-          </w:tcPr>
-          <w:p>
-            <w:pPr>
-              <w:pStyle w:val="BodyText"/>
-              <w:spacing w:after="0"/>
-              <w:ind w:left="0"/>
-              <w:jc w:val="center"/>
-              <w:rPr>
-                <w:iCs/>
-                <w:color w:val="000000"/>
-              </w:rPr>
-            </w:pPr>
-            <w:r>
-              <w:t xml:space="preserve">Prefix: </w:t>
-            </w:r>
-            <w:r>
-              <w:rPr>
-                <w:rStyle w:val="HTMLCode"/>
-                <w:rFonts w:ascii="Times New Roman" w:hAnsi="Times New Roman" w:cs="Times New Roman"/>
-              </w:rPr>
-              <w:t>* 3.14 2</w:t>
-            </w:r>
-          </w:p>
-        </w:tc>
-        <w:tc>
-          <w:tcPr>
-            <w:tcW w:w="1791" w:type="dxa"/>
-            <w:vAlign w:val="center"/>
-          </w:tcPr>
-          <w:p>
-            <w:pPr>
-              <w:pStyle w:val="BodyText"/>
-              <w:spacing w:after="0"/>
-              <w:ind w:left="0"/>
-              <w:rPr>
-                <w:iCs/>
-                <w:color w:val="000000"/>
-              </w:rPr>
-            </w:pPr>
-            <w:r>
-              <w:t>Tokenizer output: 3. 14 * 2</w:t>
-            </w:r>
-            <w:r>
-              <w:br/>
-              <w:t>Parser error: Unexpected token after end of expression: 14</w:t>
-            </w:r>
-          </w:p>
-        </w:tc>
-        <w:tc>
-          <w:tcPr>
-            <w:tcW w:w="1039" w:type="dxa"/>
-            <w:vAlign w:val="center"/>
-          </w:tcPr>
-          <w:p>
-            <w:pPr>
-              <w:pStyle w:val="BodyText"/>
-              <w:spacing w:after="0"/>
-              <w:ind w:left="0"/>
-              <w:jc w:val="center"/>
-              <w:rPr>
-                <w:iCs/>
-                <w:color w:val="000000"/>
-              </w:rPr>
-            </w:pPr>
-            <w:r>
-              <w:rPr>
-                <w:iCs/>
-                <w:color w:val="000000"/>
-              </w:rPr>
-              <w:t>Fail</w:t>
-            </w:r>
-          </w:p>
-        </w:tc>
-      </w:tr>
-      <w:tr>
-        <w:trPr>
-          <w:trHeight w:val="489"/>
-        </w:trPr>
-        <w:tc>
-          <w:tcPr>
-            <w:tcW w:w="1361" w:type="dxa"/>
-            <w:vAlign w:val="center"/>
-          </w:tcPr>
-          <w:p>
-            <w:pPr>
-              <w:pStyle w:val="BodyText"/>
-              <w:spacing w:after="0"/>
-              <w:ind w:left="0"/>
-              <w:jc w:val="center"/>
-            </w:pPr>
-            <w:r>
-              <w:t>P-TC1</w:t>
-            </w:r>
-            <w:r>
-              <w:t>5</w:t>
-            </w:r>
-          </w:p>
-        </w:tc>
-        <w:tc>
-          <w:tcPr>
-            <w:tcW w:w="1791" w:type="dxa"/>
-            <w:vAlign w:val="center"/>
-          </w:tcPr>
-          <w:p>
-            <w:pPr>
-              <w:pStyle w:val="BodyText"/>
-              <w:spacing w:after="0"/>
-              <w:ind w:left="0"/>
-              <w:jc w:val="center"/>
-              <w:rPr>
-                <w:iCs/>
-                <w:color w:val="000000"/>
-              </w:rPr>
-            </w:pPr>
-            <w:r>
-              <w:t>Verify parser handles a complex expression with precedence, parentheses, and exponentiation</w:t>
-            </w:r>
-          </w:p>
-        </w:tc>
-        <w:tc>
-          <w:tcPr>
-            <w:tcW w:w="1696" w:type="dxa"/>
-            <w:vAlign w:val="center"/>
-          </w:tcPr>
-          <w:p>
-            <w:pPr>
-              <w:pStyle w:val="BodyText"/>
-              <w:spacing w:after="0"/>
-              <w:ind w:left="0"/>
-              <w:jc w:val="center"/>
-              <w:rPr>
-                <w:iCs/>
-                <w:color w:val="000000"/>
-              </w:rPr>
-            </w:pPr>
-            <w:r>
-              <w:t>3 + 4 * 2 / (1 - 5) ** 2 ** 3</w:t>
-            </w:r>
-          </w:p>
-        </w:tc>
-        <w:tc>
-          <w:tcPr>
-            <w:tcW w:w="1791" w:type="dxa"/>
-            <w:vAlign w:val="center"/>
-          </w:tcPr>
-          <w:p>
-            <w:pPr>
-              <w:pStyle w:val="BodyText"/>
-              <w:spacing w:after="0"/>
-              <w:ind w:left="0"/>
-              <w:jc w:val="center"/>
-              <w:rPr>
-                <w:iCs/>
-                <w:color w:val="000000"/>
-              </w:rPr>
-            </w:pPr>
-            <w:r>
-              <w:t xml:space="preserve">Prefix: </w:t>
-            </w:r>
-            <w:r>
-              <w:rPr>
-                <w:rStyle w:val="HTMLCode"/>
-                <w:rFonts w:ascii="Times New Roman" w:hAnsi="Times New Roman" w:cs="Times New Roman"/>
-              </w:rPr>
-              <w:t>+ 3 / * 4 2 ** - 1 5 ** 2 3</w:t>
-            </w:r>
-          </w:p>
-        </w:tc>
-        <w:tc>
-          <w:tcPr>
-            <w:tcW w:w="1791" w:type="dxa"/>
-            <w:vAlign w:val="center"/>
-          </w:tcPr>
-          <w:p>
-            <w:pPr>
-              <w:pStyle w:val="BodyText"/>
-              <w:spacing w:after="0"/>
-              <w:ind w:left="0"/>
-              <w:jc w:val="center"/>
-              <w:rPr>
-                <w:iCs/>
-                <w:color w:val="000000"/>
-              </w:rPr>
-            </w:pPr>
-            <w:r>
-              <w:t>T</w:t>
-            </w:r>
-            <w:r>
-              <w:t>okenizer produced incorrect tokens due to character conversion issue</w:t>
-            </w:r>
-          </w:p>
-        </w:tc>
-        <w:tc>
-          <w:tcPr>
-            <w:tcW w:w="1039" w:type="dxa"/>
-            <w:vAlign w:val="center"/>
-          </w:tcPr>
-          <w:p>
-            <w:pPr>
-              <w:pStyle w:val="BodyText"/>
-              <w:spacing w:after="0"/>
-              <w:ind w:left="0"/>
-              <w:jc w:val="center"/>
-              <w:rPr>
-                <w:iCs/>
-                <w:color w:val="000000"/>
-              </w:rPr>
-            </w:pPr>
-            <w:r>
-              <w:rPr>
-                <w:iCs/>
-                <w:color w:val="000000"/>
-              </w:rPr>
-              <w:t>Fail</w:t>
             </w:r>
           </w:p>
         </w:tc>
@@ -4384,16 +3572,7 @@
         </w:tcPr>
         <w:p>
           <w:r>
-            <w:t>EECS348-</w:t>
-          </w:r>
-          <w:r>
-            <w:t>TC</w:t>
-          </w:r>
-          <w:r>
-            <w:t>-TermProj-v1.</w:t>
-          </w:r>
-          <w:r>
-            <w:t>0</w:t>
+            <w:t>EECS348-TC-TermProj-v1.0</w:t>
           </w:r>
         </w:p>
       </w:tc>

</xml_diff>

<commit_message>
Update test cases document
</commit_message>
<xml_diff>
--- a/documentation/05-Test-Cases.docx
+++ b/documentation/05-Test-Cases.docx
@@ -61,7 +61,13 @@
         <w:rPr>
           <w:sz w:val="28"/>
         </w:rPr>
-        <w:t>1.1</w:t>
+        <w:t>1.</w:t>
+      </w:r>
+      <w:r>
+        <w:rPr>
+          <w:sz w:val="28"/>
+        </w:rPr>
+        <w:t>2</w:t>
       </w:r>
     </w:p>
     <w:p>
@@ -6493,7 +6499,10 @@
             <w:t xml:space="preserve">  Version:           </w:t>
           </w:r>
           <w:r>
-            <w:t>1.0</w:t>
+            <w:t>1.</w:t>
+          </w:r>
+          <w:r>
+            <w:t>2</w:t>
           </w:r>
         </w:p>
       </w:tc>

</xml_diff>